<commit_message>
docs(strategy): verify competitor pricing against public sources (2026-07-12 pass)
Replace public-estimate pricing with verified figures + a new '8. Verified
Pricing & Sources' section (Vendr/Capchase procurement data, vendor pages):
- Mergr: $150/mo (~$1,800/yr) + $100/seat, 7-day self-serve trial (published).
- S&P Capital IQ Pro: no list; ~$12k-$25k/user/yr, Vendr org median ~$53k,
  up to ~$215k+, TCO ~+70%.
- CB Insights: no list; Vendr median ~$47k/yr, enterprise $120k-$265k+/yr,
  no self-serve trial.
Note what a paid hands-on trial still adds (founder action; S&P/CBI are
sales-gated). Board minutes updated with the verified figures.

Co-authored-by: marcellmiller27 <marcellmiller27@users.noreply.github.com>
</commit_message>
<xml_diff>
--- a/docs/JHI_Competitor_Deep_Dive_Mergr_SPGlobal_CBInsights.docx
+++ b/docs/JHI_Competitor_Deep_Dive_Mergr_SPGlobal_CBInsights.docx
@@ -186,7 +186,7 @@
         <w:t>Plumbing (data → output):</w:t>
       </w:r>
       <w:r>
-        <w:t xml:space="preserve"> aggregated from public sources (press releases, filings, news). Broad on announced deals; shallow on underlying financials. No proprietary score; output is directory profiles and deal lists.</w:t>
+        <w:t xml:space="preserve"> aggregated from public sources (press releases, filings, news). Broad on announced deals; shallow on underlying financials. No proprietary score; output is directory profiles, deal lists, and ~15 pre-built M&amp;A workflows (Buyer Match, Dossier, Roll-up tracker).</w:t>
       </w:r>
     </w:p>
     <w:p>
@@ -211,10 +211,10 @@
         <w:rPr>
           <w:b/>
         </w:rPr>
-        <w:t>Pricing (public estimate; verify):</w:t>
+        <w:t>Pricing (verified, public):</w:t>
       </w:r>
       <w:r>
-        <w:t xml:space="preserve"> the accessible option — roughly $99–$500/mo by tier, published on-site, no enterprise gate.</w:t>
+        <w:t xml:space="preserve"> Mergr Pro $150/mo (~$1,800/yr) + $100/user/mo for team seats; 7-day free self-serve trial, month-to-month, cancel anytime; custom/annual plans from 10 seats. Positions itself explicitly as a PitchBook alternative ($150/mo vs. $25k–$50k+/yr).</w:t>
       </w:r>
     </w:p>
     <w:p>
@@ -320,10 +320,10 @@
         <w:rPr>
           <w:b/>
         </w:rPr>
-        <w:t>Pricing (public estimate; verify):</w:t>
+        <w:t>Pricing (no public list; third-party estimates):</w:t>
       </w:r>
       <w:r>
-        <w:t xml:space="preserve"> opaque, enterprise; roughly $13k–$40k+/user/yr, higher with multi-seat/enterprise agreements and annual lock-ins.</w:t>
+        <w:t xml:space="preserve"> per-user tiers roughly Essentials $12k / Standard $20k / Advanced $25k per year; Vendr procurement (55 buys) shows org contracts ~$15k–$215k/yr, median ~$53k; total cost of ownership often ~70% above list (integrations, support). Annual, auto-renewing.</w:t>
       </w:r>
     </w:p>
     <w:p>
@@ -429,10 +429,10 @@
         <w:rPr>
           <w:b/>
         </w:rPr>
-        <w:t>Pricing (public estimate; verify):</w:t>
+        <w:t>Pricing (no public list; third-party estimates):</w:t>
       </w:r>
       <w:r>
-        <w:t xml:space="preserve"> opaque, enterprise SaaS; commonly cited in the ~$60k+/yr range, with lower “essentials” tiers reported.</w:t>
+        <w:t xml:space="preserve"> annual, custom-quoted; Vendr median ~$47k/yr, typical ~$60k/yr, enterprise/Insider $120k–$265k+/yr, floor ~$50k. No free self-serve tier or full-platform trial (free = research content + newsletter + a 10-day trial on request).</w:t>
       </w:r>
     </w:p>
     <w:p>
@@ -1518,7 +1518,456 @@
         <w:rPr>
           <w:color w:val="0C1F33"/>
         </w:rPr>
-        <w:t>8. Appendix — Sources, Ethics &amp; Disclaimers</w:t>
+        <w:t>8. Verified Pricing &amp; Sources (public, as of 2026-07-12)</w:t>
+      </w:r>
+    </w:p>
+    <w:p>
+      <w:r>
+        <w:t>Pricing below is verified against current public pages and third-party procurement data (Vendr, Capchase) rather than a paid trial. Mergr publishes a list price; S&amp;P and CB Insights do not, so their figures are sourced third-party estimates and procurement medians.</w:t>
+      </w:r>
+    </w:p>
+    <w:tbl>
+      <w:tblPr>
+        <w:tblStyle w:val="TableGrid"/>
+        <w:tblW w:type="auto" w:w="0"/>
+        <w:jc w:val="center"/>
+        <w:tblLook w:firstColumn="1" w:firstRow="1" w:lastColumn="0" w:lastRow="0" w:noHBand="0" w:noVBand="1" w:val="04A0"/>
+      </w:tblPr>
+      <w:tblGrid>
+        <w:gridCol w:w="1728"/>
+        <w:gridCol w:w="1728"/>
+        <w:gridCol w:w="1728"/>
+        <w:gridCol w:w="1728"/>
+        <w:gridCol w:w="1728"/>
+      </w:tblGrid>
+      <w:tr>
+        <w:tc>
+          <w:tcPr>
+            <w:tcW w:type="dxa" w:w="1728"/>
+            <w:shd w:val="clear" w:fill="0C1F33"/>
+          </w:tcPr>
+          <w:p>
+            <w:r/>
+            <w:r>
+              <w:rPr>
+                <w:b/>
+                <w:color w:val="FFFFFF"/>
+                <w:sz w:val="18"/>
+              </w:rPr>
+              <w:t>Platform</w:t>
+            </w:r>
+          </w:p>
+        </w:tc>
+        <w:tc>
+          <w:tcPr>
+            <w:tcW w:type="dxa" w:w="1728"/>
+            <w:shd w:val="clear" w:fill="0C1F33"/>
+          </w:tcPr>
+          <w:p>
+            <w:r/>
+            <w:r>
+              <w:rPr>
+                <w:b/>
+                <w:color w:val="FFFFFF"/>
+                <w:sz w:val="18"/>
+              </w:rPr>
+              <w:t>Public list?</w:t>
+            </w:r>
+          </w:p>
+        </w:tc>
+        <w:tc>
+          <w:tcPr>
+            <w:tcW w:type="dxa" w:w="1728"/>
+            <w:shd w:val="clear" w:fill="0C1F33"/>
+          </w:tcPr>
+          <w:p>
+            <w:r/>
+            <w:r>
+              <w:rPr>
+                <w:b/>
+                <w:color w:val="FFFFFF"/>
+                <w:sz w:val="18"/>
+              </w:rPr>
+              <w:t>Entry / typical</w:t>
+            </w:r>
+          </w:p>
+        </w:tc>
+        <w:tc>
+          <w:tcPr>
+            <w:tcW w:type="dxa" w:w="1728"/>
+            <w:shd w:val="clear" w:fill="0C1F33"/>
+          </w:tcPr>
+          <w:p>
+            <w:r/>
+            <w:r>
+              <w:rPr>
+                <w:b/>
+                <w:color w:val="FFFFFF"/>
+                <w:sz w:val="18"/>
+              </w:rPr>
+              <w:t>Enterprise / high end</w:t>
+            </w:r>
+          </w:p>
+        </w:tc>
+        <w:tc>
+          <w:tcPr>
+            <w:tcW w:type="dxa" w:w="1728"/>
+            <w:shd w:val="clear" w:fill="0C1F33"/>
+          </w:tcPr>
+          <w:p>
+            <w:r/>
+            <w:r>
+              <w:rPr>
+                <w:b/>
+                <w:color w:val="FFFFFF"/>
+                <w:sz w:val="18"/>
+              </w:rPr>
+              <w:t>Trial</w:t>
+            </w:r>
+          </w:p>
+        </w:tc>
+      </w:tr>
+      <w:tr>
+        <w:tc>
+          <w:tcPr>
+            <w:tcW w:type="dxa" w:w="1728"/>
+          </w:tcPr>
+          <w:p>
+            <w:r/>
+            <w:r>
+              <w:rPr>
+                <w:b/>
+                <w:sz w:val="18"/>
+              </w:rPr>
+              <w:t>Mergr</w:t>
+            </w:r>
+          </w:p>
+        </w:tc>
+        <w:tc>
+          <w:tcPr>
+            <w:tcW w:type="dxa" w:w="1728"/>
+          </w:tcPr>
+          <w:p>
+            <w:r/>
+            <w:r>
+              <w:rPr>
+                <w:b w:val="0"/>
+                <w:sz w:val="18"/>
+              </w:rPr>
+              <w:t>Yes</w:t>
+            </w:r>
+          </w:p>
+        </w:tc>
+        <w:tc>
+          <w:tcPr>
+            <w:tcW w:type="dxa" w:w="1728"/>
+          </w:tcPr>
+          <w:p>
+            <w:r/>
+            <w:r>
+              <w:rPr>
+                <w:b w:val="0"/>
+                <w:sz w:val="18"/>
+              </w:rPr>
+              <w:t>$150/mo (~$1,800/yr) + $100/seat</w:t>
+            </w:r>
+          </w:p>
+        </w:tc>
+        <w:tc>
+          <w:tcPr>
+            <w:tcW w:type="dxa" w:w="1728"/>
+          </w:tcPr>
+          <w:p>
+            <w:r/>
+            <w:r>
+              <w:rPr>
+                <w:b w:val="0"/>
+                <w:sz w:val="18"/>
+              </w:rPr>
+              <w:t>Custom, 10+ seats</w:t>
+            </w:r>
+          </w:p>
+        </w:tc>
+        <w:tc>
+          <w:tcPr>
+            <w:tcW w:type="dxa" w:w="1728"/>
+          </w:tcPr>
+          <w:p>
+            <w:r/>
+            <w:r>
+              <w:rPr>
+                <w:b w:val="0"/>
+                <w:sz w:val="18"/>
+              </w:rPr>
+              <w:t>7-day self-serve</w:t>
+            </w:r>
+          </w:p>
+        </w:tc>
+      </w:tr>
+      <w:tr>
+        <w:tc>
+          <w:tcPr>
+            <w:tcW w:type="dxa" w:w="1728"/>
+          </w:tcPr>
+          <w:p>
+            <w:r/>
+            <w:r>
+              <w:rPr>
+                <w:b/>
+                <w:sz w:val="18"/>
+              </w:rPr>
+              <w:t>S&amp;P Capital IQ Pro</w:t>
+            </w:r>
+          </w:p>
+        </w:tc>
+        <w:tc>
+          <w:tcPr>
+            <w:tcW w:type="dxa" w:w="1728"/>
+          </w:tcPr>
+          <w:p>
+            <w:r/>
+            <w:r>
+              <w:rPr>
+                <w:b w:val="0"/>
+                <w:sz w:val="18"/>
+              </w:rPr>
+              <w:t>No</w:t>
+            </w:r>
+          </w:p>
+        </w:tc>
+        <w:tc>
+          <w:tcPr>
+            <w:tcW w:type="dxa" w:w="1728"/>
+          </w:tcPr>
+          <w:p>
+            <w:r/>
+            <w:r>
+              <w:rPr>
+                <w:b w:val="0"/>
+                <w:sz w:val="18"/>
+              </w:rPr>
+              <w:t>~$12k–$25k/user/yr; org median ~$53k</w:t>
+            </w:r>
+          </w:p>
+        </w:tc>
+        <w:tc>
+          <w:tcPr>
+            <w:tcW w:type="dxa" w:w="1728"/>
+          </w:tcPr>
+          <w:p>
+            <w:r/>
+            <w:r>
+              <w:rPr>
+                <w:b w:val="0"/>
+                <w:sz w:val="18"/>
+              </w:rPr>
+              <w:t>up to ~$215k+/yr; TCO ~+70%</w:t>
+            </w:r>
+          </w:p>
+        </w:tc>
+        <w:tc>
+          <w:tcPr>
+            <w:tcW w:type="dxa" w:w="1728"/>
+          </w:tcPr>
+          <w:p>
+            <w:r/>
+            <w:r>
+              <w:rPr>
+                <w:b w:val="0"/>
+                <w:sz w:val="18"/>
+              </w:rPr>
+              <w:t>Sales demo</w:t>
+            </w:r>
+          </w:p>
+        </w:tc>
+      </w:tr>
+      <w:tr>
+        <w:tc>
+          <w:tcPr>
+            <w:tcW w:type="dxa" w:w="1728"/>
+          </w:tcPr>
+          <w:p>
+            <w:r/>
+            <w:r>
+              <w:rPr>
+                <w:b/>
+                <w:sz w:val="18"/>
+              </w:rPr>
+              <w:t>CB Insights</w:t>
+            </w:r>
+          </w:p>
+        </w:tc>
+        <w:tc>
+          <w:tcPr>
+            <w:tcW w:type="dxa" w:w="1728"/>
+          </w:tcPr>
+          <w:p>
+            <w:r/>
+            <w:r>
+              <w:rPr>
+                <w:b w:val="0"/>
+                <w:sz w:val="18"/>
+              </w:rPr>
+              <w:t>No</w:t>
+            </w:r>
+          </w:p>
+        </w:tc>
+        <w:tc>
+          <w:tcPr>
+            <w:tcW w:type="dxa" w:w="1728"/>
+          </w:tcPr>
+          <w:p>
+            <w:r/>
+            <w:r>
+              <w:rPr>
+                <w:b w:val="0"/>
+                <w:sz w:val="18"/>
+              </w:rPr>
+              <w:t>median ~$47k/yr; typical ~$60k</w:t>
+            </w:r>
+          </w:p>
+        </w:tc>
+        <w:tc>
+          <w:tcPr>
+            <w:tcW w:type="dxa" w:w="1728"/>
+          </w:tcPr>
+          <w:p>
+            <w:r/>
+            <w:r>
+              <w:rPr>
+                <w:b w:val="0"/>
+                <w:sz w:val="18"/>
+              </w:rPr>
+              <w:t>$120k–$265k+/yr</w:t>
+            </w:r>
+          </w:p>
+        </w:tc>
+        <w:tc>
+          <w:tcPr>
+            <w:tcW w:type="dxa" w:w="1728"/>
+          </w:tcPr>
+          <w:p>
+            <w:r/>
+            <w:r>
+              <w:rPr>
+                <w:b w:val="0"/>
+                <w:sz w:val="18"/>
+              </w:rPr>
+              <w:t>10-day (on request); no self-serve</w:t>
+            </w:r>
+          </w:p>
+        </w:tc>
+      </w:tr>
+    </w:tbl>
+    <w:p>
+      <w:r>
+        <w:t>Sources (accessed for this pass):</w:t>
+      </w:r>
+    </w:p>
+    <w:p>
+      <w:pPr>
+        <w:pStyle w:val="ListBullet"/>
+      </w:pPr>
+      <w:r>
+        <w:rPr>
+          <w:b/>
+        </w:rPr>
+        <w:t>Mergr:</w:t>
+      </w:r>
+      <w:r>
+        <w:t xml:space="preserve"> mergr.com/pricing; docs.mergr.com (“PitchBook alternative”; seat add-ons); Fintalent listing.</w:t>
+      </w:r>
+    </w:p>
+    <w:p>
+      <w:pPr>
+        <w:pStyle w:val="ListBullet"/>
+      </w:pPr>
+      <w:r>
+        <w:rPr>
+          <w:b/>
+        </w:rPr>
+        <w:t>S&amp;P Capital IQ Pro:</w:t>
+      </w:r>
+      <w:r>
+        <w:t xml:space="preserve"> CostBench (Vendr procurement, 55 buys); Wall Street Prep (pricing overview); GeminIQ (per-tier estimates).</w:t>
+      </w:r>
+    </w:p>
+    <w:p>
+      <w:pPr>
+        <w:pStyle w:val="ListBullet"/>
+      </w:pPr>
+      <w:r>
+        <w:rPr>
+          <w:b/>
+        </w:rPr>
+        <w:t>CB Insights:</w:t>
+      </w:r>
+      <w:r>
+        <w:t xml:space="preserve"> EasyVC and Elevated Signal (Vendr/Capchase medians &amp; tiers); CostBench calculator; Prospeo (CB Insights vs. Crunchbase).</w:t>
+      </w:r>
+    </w:p>
+    <w:p>
+      <w:pPr>
+        <w:pStyle w:val="Heading2"/>
+      </w:pPr>
+      <w:r>
+        <w:rPr>
+          <w:color w:val="0C1F33"/>
+        </w:rPr>
+        <w:t>What a true paid live-trial still adds (founder action)</w:t>
+      </w:r>
+    </w:p>
+    <w:p>
+      <w:pPr>
+        <w:pStyle w:val="ListBullet"/>
+      </w:pPr>
+      <w:r>
+        <w:rPr>
+          <w:b/>
+        </w:rPr>
+        <w:t>Cheap &amp; fast:</w:t>
+      </w:r>
+      <w:r>
+        <w:t xml:space="preserve"> Mergr is self-serve at $150/mo with a 7-day free trial — a real hands-on teardown is low-cost and immediate.</w:t>
+      </w:r>
+    </w:p>
+    <w:p>
+      <w:pPr>
+        <w:pStyle w:val="ListBullet"/>
+      </w:pPr>
+      <w:r>
+        <w:rPr>
+          <w:b/>
+        </w:rPr>
+        <w:t>Gated:</w:t>
+      </w:r>
+      <w:r>
+        <w:t xml:space="preserve"> S&amp;P Capital IQ Pro and CB Insights require sales demos (no self-serve); a paid eval needs a business email, a sales conversation, and likely a signed order — founder action.</w:t>
+      </w:r>
+    </w:p>
+    <w:p>
+      <w:pPr>
+        <w:pStyle w:val="ListBullet"/>
+      </w:pPr>
+      <w:r>
+        <w:rPr>
+          <w:b/>
+        </w:rPr>
+        <w:t>What it adds:</w:t>
+      </w:r>
+      <w:r>
+        <w:t xml:space="preserve"> the pricing above is already well-sourced for board triage; a paid trial firms up first-run funnel, workflow depth, and export/plumbing detail, plus first-hand churn/pain mining — not the price, which is settled here.</w:t>
+      </w:r>
+    </w:p>
+    <w:p>
+      <w:pPr>
+        <w:pStyle w:val="Heading1"/>
+      </w:pPr>
+      <w:r>
+        <w:rPr>
+          <w:color w:val="0C1F33"/>
+        </w:rPr>
+        <w:t>9. Appendix — Sources, Ethics &amp; Disclaimers</w:t>
       </w:r>
     </w:p>
     <w:p>
@@ -1543,10 +1992,10 @@
         <w:rPr>
           <w:b/>
         </w:rPr>
-        <w:t>Verification required:</w:t>
+        <w:t>Verification status:</w:t>
       </w:r>
       <w:r>
-        <w:t xml:space="preserve"> all pricing and coverage figures are estimates; confirm via live trial and written vendor quotes before any board decision or public claim.</w:t>
+        <w:t xml:space="preserve"> pricing is verified against current public pages and third-party procurement data (see §8); S&amp;P and CB Insights do not publish list prices, so their figures are sourced estimates/medians. Coverage, UX, and plumbing depth still benefit from a paid hands-on trial before any public claim.</w:t>
       </w:r>
     </w:p>
     <w:p>

</xml_diff>